<commit_message>
learnt about different types of sql commands and creation using of databases
</commit_message>
<xml_diff>
--- a/SQL/SQL NOTES.docx
+++ b/SQL/SQL NOTES.docx
@@ -405,15 +405,7 @@
       </w:r>
       <w:proofErr w:type="spellEnd"/>
       <w:r>
-        <w:t xml:space="preserve"> </w:t>
-      </w:r>
-      <w:proofErr w:type="spellStart"/>
-      <w:r>
-        <w:t>hai</w:t>
-      </w:r>
-      <w:proofErr w:type="spellEnd"/>
-      <w:r>
-        <w:t>.</w:t>
+        <w:t xml:space="preserve"> hai.</w:t>
       </w:r>
     </w:p>
     <w:p/>
@@ -469,6 +461,9 @@
         <w:t xml:space="preserve">            </w:t>
       </w:r>
       <w:r>
+        <w:rPr>
+          <w:noProof/>
+        </w:rPr>
         <w:drawing>
           <wp:inline distT="0" distB="0" distL="0" distR="0" wp14:anchorId="655D1A97" wp14:editId="3FD1F1F1">
             <wp:extent cx="4892464" cy="2408129"/>
@@ -512,6 +507,9 @@
         <w:t xml:space="preserve">             </w:t>
       </w:r>
       <w:r>
+        <w:rPr>
+          <w:noProof/>
+        </w:rPr>
         <w:drawing>
           <wp:inline distT="0" distB="0" distL="0" distR="0" wp14:anchorId="419D4F8D" wp14:editId="4B01A9CA">
             <wp:extent cx="4854361" cy="4724809"/>
@@ -1059,6 +1057,9 @@
         <w:t xml:space="preserve">          </w:t>
       </w:r>
       <w:r>
+        <w:rPr>
+          <w:noProof/>
+        </w:rPr>
         <w:drawing>
           <wp:inline distT="0" distB="0" distL="0" distR="0" wp14:anchorId="1A065E9D" wp14:editId="343DE194">
             <wp:extent cx="5053166" cy="2958860"/>
@@ -1102,6 +1103,9 @@
         <w:t xml:space="preserve">                   </w:t>
       </w:r>
       <w:r>
+        <w:rPr>
+          <w:noProof/>
+        </w:rPr>
         <w:drawing>
           <wp:inline distT="0" distB="0" distL="0" distR="0" wp14:anchorId="7C636C45" wp14:editId="60399EB7">
             <wp:extent cx="4538075" cy="1664898"/>
@@ -1144,6 +1148,9 @@
         <w:t xml:space="preserve">                 </w:t>
       </w:r>
       <w:r>
+        <w:rPr>
+          <w:noProof/>
+        </w:rPr>
         <w:drawing>
           <wp:inline distT="0" distB="0" distL="0" distR="0" wp14:anchorId="01FE5C30" wp14:editId="7099ADCB">
             <wp:extent cx="4641011" cy="1518355"/>
@@ -1215,6 +1222,9 @@
         <w:t xml:space="preserve">                      </w:t>
       </w:r>
       <w:r>
+        <w:rPr>
+          <w:noProof/>
+        </w:rPr>
         <w:drawing>
           <wp:inline distT="0" distB="0" distL="0" distR="0" wp14:anchorId="7E2CDCF3" wp14:editId="2DC7D89A">
             <wp:extent cx="4267200" cy="1811547"/>
@@ -1257,6 +1267,9 @@
         <w:t xml:space="preserve">                     </w:t>
       </w:r>
       <w:r>
+        <w:rPr>
+          <w:noProof/>
+        </w:rPr>
         <w:drawing>
           <wp:inline distT="0" distB="0" distL="0" distR="0" wp14:anchorId="14B640FD" wp14:editId="41FCB8E1">
             <wp:extent cx="4283566" cy="3010619"/>
@@ -1298,7 +1311,7 @@
       <w:r>
         <w:lastRenderedPageBreak/>
         <w:pict w14:anchorId="5BB414D9">
-          <v:rect id="_x0000_i1027" style="width:0;height:1.5pt" o:hralign="center" o:hrstd="t" o:hr="t" fillcolor="#a0a0a0" stroked="f"/>
+          <v:rect id="_x0000_i1026" style="width:0;height:1.5pt" o:hralign="center" o:hrstd="t" o:hr="t" fillcolor="#a0a0a0" stroked="f"/>
         </w:pict>
       </w:r>
     </w:p>
@@ -2599,7 +2612,7 @@
       <w:r>
         <w:lastRenderedPageBreak/>
         <w:pict w14:anchorId="6886A853">
-          <v:rect id="_x0000_i1026" style="width:0;height:1.5pt" o:hralign="center" o:hrstd="t" o:hr="t" fillcolor="#a0a0a0" stroked="f"/>
+          <v:rect id="_x0000_i1027" style="width:0;height:1.5pt" o:hralign="center" o:hrstd="t" o:hr="t" fillcolor="#a0a0a0" stroked="f"/>
         </w:pict>
       </w:r>
     </w:p>
@@ -4929,15 +4942,7 @@
       </w:r>
       <w:proofErr w:type="spellEnd"/>
       <w:r>
-        <w:t xml:space="preserve"> </w:t>
-      </w:r>
-      <w:proofErr w:type="spellStart"/>
-      <w:r>
-        <w:t>ke</w:t>
-      </w:r>
-      <w:proofErr w:type="spellEnd"/>
-      <w:r>
-        <w:t xml:space="preserve"> </w:t>
+        <w:t xml:space="preserve"> ke </w:t>
       </w:r>
       <w:proofErr w:type="spellStart"/>
       <w:r>
@@ -5807,6 +5812,14 @@
       </w:r>
       <w:proofErr w:type="spellStart"/>
       <w:r>
+        <w:t>karti</w:t>
+      </w:r>
+      <w:proofErr w:type="spellEnd"/>
+      <w:r>
+        <w:t xml:space="preserve"> </w:t>
+      </w:r>
+      <w:proofErr w:type="spellStart"/>
+      <w:r>
         <w:t>hai</w:t>
       </w:r>
       <w:proofErr w:type="spellEnd"/>
@@ -6112,15 +6125,13 @@
       </w:r>
       <w:proofErr w:type="spellEnd"/>
       <w:r>
-        <w:t xml:space="preserve"> ki </w:t>
-      </w:r>
-      <w:proofErr w:type="spellStart"/>
-      <w:r>
-        <w:t>permissiondoge</w:t>
-      </w:r>
-      <w:proofErr w:type="spellEnd"/>
-      <w:r>
-        <w:t xml:space="preserve"> aur </w:t>
+        <w:t xml:space="preserve"> ki permission</w:t>
+      </w:r>
+      <w:r>
+        <w:t xml:space="preserve"> </w:t>
+      </w:r>
+      <w:r>
+        <w:t xml:space="preserve">doge aur </w:t>
       </w:r>
       <w:proofErr w:type="spellStart"/>
       <w:r>
@@ -7258,6 +7269,1655 @@
         <w:pict w14:anchorId="411153E2">
           <v:rect id="_x0000_i1029" style="width:0;height:1.5pt" o:hralign="center" o:hrstd="t" o:hr="t" fillcolor="#a0a0a0" stroked="f"/>
         </w:pict>
+      </w:r>
+    </w:p>
+    <w:p/>
+    <w:p>
+      <w:pPr>
+        <w:rPr>
+          <w:b/>
+          <w:bCs/>
+        </w:rPr>
+      </w:pPr>
+    </w:p>
+    <w:p>
+      <w:pPr>
+        <w:rPr>
+          <w:b/>
+          <w:bCs/>
+          <w:sz w:val="40"/>
+          <w:szCs w:val="40"/>
+          <w:u w:val="single"/>
+        </w:rPr>
+      </w:pPr>
+      <w:r>
+        <w:rPr>
+          <w:b/>
+          <w:bCs/>
+          <w:sz w:val="40"/>
+          <w:szCs w:val="40"/>
+          <w:u w:val="single"/>
+        </w:rPr>
+        <w:lastRenderedPageBreak/>
+        <w:t>SQL NOTES (</w:t>
+      </w:r>
+      <w:r>
+        <w:rPr>
+          <w:b/>
+          <w:bCs/>
+          <w:sz w:val="40"/>
+          <w:szCs w:val="40"/>
+          <w:u w:val="single"/>
+        </w:rPr>
+        <w:t>5</w:t>
+      </w:r>
+      <w:r>
+        <w:rPr>
+          <w:b/>
+          <w:bCs/>
+          <w:sz w:val="40"/>
+          <w:szCs w:val="40"/>
+          <w:u w:val="single"/>
+        </w:rPr>
+        <w:t>)</w:t>
+      </w:r>
+    </w:p>
+    <w:p>
+      <w:pPr>
+        <w:rPr>
+          <w:b/>
+          <w:bCs/>
+        </w:rPr>
+      </w:pPr>
+      <w:r>
+        <w:rPr>
+          <w:b/>
+          <w:bCs/>
+        </w:rPr>
+        <w:drawing>
+          <wp:inline distT="0" distB="0" distL="0" distR="0" wp14:anchorId="310CEABA" wp14:editId="196128B9">
+            <wp:extent cx="5731510" cy="2811780"/>
+            <wp:effectExtent l="0" t="0" r="2540" b="7620"/>
+            <wp:docPr id="501025264" name="Picture 1"/>
+            <wp:cNvGraphicFramePr>
+              <a:graphicFrameLocks xmlns:a="http://schemas.openxmlformats.org/drawingml/2006/main" noChangeAspect="1"/>
+            </wp:cNvGraphicFramePr>
+            <a:graphic xmlns:a="http://schemas.openxmlformats.org/drawingml/2006/main">
+              <a:graphicData uri="http://schemas.openxmlformats.org/drawingml/2006/picture">
+                <pic:pic xmlns:pic="http://schemas.openxmlformats.org/drawingml/2006/picture">
+                  <pic:nvPicPr>
+                    <pic:cNvPr id="501025264" name=""/>
+                    <pic:cNvPicPr/>
+                  </pic:nvPicPr>
+                  <pic:blipFill>
+                    <a:blip r:embed="rId15"/>
+                    <a:stretch>
+                      <a:fillRect/>
+                    </a:stretch>
+                  </pic:blipFill>
+                  <pic:spPr>
+                    <a:xfrm>
+                      <a:off x="0" y="0"/>
+                      <a:ext cx="5731510" cy="2811780"/>
+                    </a:xfrm>
+                    <a:prstGeom prst="rect">
+                      <a:avLst/>
+                    </a:prstGeom>
+                  </pic:spPr>
+                </pic:pic>
+              </a:graphicData>
+            </a:graphic>
+          </wp:inline>
+        </w:drawing>
+      </w:r>
+    </w:p>
+    <w:p>
+      <w:pPr>
+        <w:rPr>
+          <w:b/>
+          <w:bCs/>
+        </w:rPr>
+      </w:pPr>
+      <w:r>
+        <w:rPr>
+          <w:b/>
+          <w:bCs/>
+        </w:rPr>
+        <w:t>Databases and related SQL Commands</w:t>
+      </w:r>
+    </w:p>
+    <w:p>
+      <w:pPr>
+        <w:rPr>
+          <w:b/>
+          <w:bCs/>
+        </w:rPr>
+      </w:pPr>
+      <w:r>
+        <w:rPr>
+          <w:b/>
+          <w:bCs/>
+        </w:rPr>
+        <w:drawing>
+          <wp:inline distT="0" distB="0" distL="0" distR="0" wp14:anchorId="06148AFA" wp14:editId="20A7ADE1">
+            <wp:extent cx="5731510" cy="2422525"/>
+            <wp:effectExtent l="0" t="0" r="2540" b="0"/>
+            <wp:docPr id="2069743766" name="Picture 1"/>
+            <wp:cNvGraphicFramePr>
+              <a:graphicFrameLocks xmlns:a="http://schemas.openxmlformats.org/drawingml/2006/main" noChangeAspect="1"/>
+            </wp:cNvGraphicFramePr>
+            <a:graphic xmlns:a="http://schemas.openxmlformats.org/drawingml/2006/main">
+              <a:graphicData uri="http://schemas.openxmlformats.org/drawingml/2006/picture">
+                <pic:pic xmlns:pic="http://schemas.openxmlformats.org/drawingml/2006/picture">
+                  <pic:nvPicPr>
+                    <pic:cNvPr id="2069743766" name=""/>
+                    <pic:cNvPicPr/>
+                  </pic:nvPicPr>
+                  <pic:blipFill>
+                    <a:blip r:embed="rId16"/>
+                    <a:stretch>
+                      <a:fillRect/>
+                    </a:stretch>
+                  </pic:blipFill>
+                  <pic:spPr>
+                    <a:xfrm>
+                      <a:off x="0" y="0"/>
+                      <a:ext cx="5731510" cy="2422525"/>
+                    </a:xfrm>
+                    <a:prstGeom prst="rect">
+                      <a:avLst/>
+                    </a:prstGeom>
+                  </pic:spPr>
+                </pic:pic>
+              </a:graphicData>
+            </a:graphic>
+          </wp:inline>
+        </w:drawing>
+      </w:r>
+    </w:p>
+    <w:p>
+      <w:pPr>
+        <w:rPr>
+          <w:b/>
+          <w:bCs/>
+        </w:rPr>
+      </w:pPr>
+    </w:p>
+    <w:p>
+      <w:pPr>
+        <w:rPr>
+          <w:b/>
+          <w:bCs/>
+        </w:rPr>
+      </w:pPr>
+      <w:r>
+        <w:rPr>
+          <w:b/>
+          <w:bCs/>
+        </w:rPr>
+        <w:t>1. Database Banana (CREATE DATABASE)</w:t>
+      </w:r>
+    </w:p>
+    <w:p>
+      <w:r>
+        <w:t xml:space="preserve">Jab </w:t>
+      </w:r>
+      <w:proofErr w:type="spellStart"/>
+      <w:r>
+        <w:t>hume</w:t>
+      </w:r>
+      <w:proofErr w:type="spellEnd"/>
+      <w:r>
+        <w:t xml:space="preserve"> </w:t>
+      </w:r>
+      <w:proofErr w:type="spellStart"/>
+      <w:r>
+        <w:t>naya</w:t>
+      </w:r>
+      <w:proofErr w:type="spellEnd"/>
+      <w:r>
+        <w:t xml:space="preserve"> project </w:t>
+      </w:r>
+      <w:proofErr w:type="spellStart"/>
+      <w:r>
+        <w:t>ya</w:t>
+      </w:r>
+      <w:proofErr w:type="spellEnd"/>
+      <w:r>
+        <w:t xml:space="preserve"> </w:t>
+      </w:r>
+      <w:proofErr w:type="spellStart"/>
+      <w:r>
+        <w:t>naya</w:t>
+      </w:r>
+      <w:proofErr w:type="spellEnd"/>
+      <w:r>
+        <w:t xml:space="preserve"> system </w:t>
+      </w:r>
+      <w:proofErr w:type="spellStart"/>
+      <w:r>
+        <w:t>shuru</w:t>
+      </w:r>
+      <w:proofErr w:type="spellEnd"/>
+      <w:r>
+        <w:t xml:space="preserve"> </w:t>
+      </w:r>
+      <w:proofErr w:type="spellStart"/>
+      <w:r>
+        <w:t>karna</w:t>
+      </w:r>
+      <w:proofErr w:type="spellEnd"/>
+      <w:r>
+        <w:t xml:space="preserve"> </w:t>
+      </w:r>
+      <w:proofErr w:type="spellStart"/>
+      <w:r>
+        <w:t>hota</w:t>
+      </w:r>
+      <w:proofErr w:type="spellEnd"/>
+      <w:r>
+        <w:t xml:space="preserve"> </w:t>
+      </w:r>
+      <w:proofErr w:type="spellStart"/>
+      <w:r>
+        <w:t>hai</w:t>
+      </w:r>
+      <w:proofErr w:type="spellEnd"/>
+      <w:r>
+        <w:t xml:space="preserve">, </w:t>
+      </w:r>
+      <w:proofErr w:type="spellStart"/>
+      <w:r>
+        <w:t>toh</w:t>
+      </w:r>
+      <w:proofErr w:type="spellEnd"/>
+      <w:r>
+        <w:t xml:space="preserve"> </w:t>
+      </w:r>
+      <w:proofErr w:type="spellStart"/>
+      <w:r>
+        <w:t>sabse</w:t>
+      </w:r>
+      <w:proofErr w:type="spellEnd"/>
+      <w:r>
+        <w:t xml:space="preserve"> </w:t>
+      </w:r>
+      <w:proofErr w:type="spellStart"/>
+      <w:r>
+        <w:t>pehle</w:t>
+      </w:r>
+      <w:proofErr w:type="spellEnd"/>
+      <w:r>
+        <w:t xml:space="preserve"> </w:t>
+      </w:r>
+      <w:proofErr w:type="spellStart"/>
+      <w:r>
+        <w:t>hume</w:t>
+      </w:r>
+      <w:proofErr w:type="spellEnd"/>
+      <w:r>
+        <w:t xml:space="preserve"> ek </w:t>
+      </w:r>
+      <w:proofErr w:type="spellStart"/>
+      <w:r>
+        <w:t>naya</w:t>
+      </w:r>
+      <w:proofErr w:type="spellEnd"/>
+      <w:r>
+        <w:t xml:space="preserve"> database banana </w:t>
+      </w:r>
+      <w:proofErr w:type="spellStart"/>
+      <w:r>
+        <w:t>padta</w:t>
+      </w:r>
+      <w:proofErr w:type="spellEnd"/>
+      <w:r>
+        <w:t xml:space="preserve"> </w:t>
+      </w:r>
+      <w:proofErr w:type="spellStart"/>
+      <w:r>
+        <w:t>hai</w:t>
+      </w:r>
+      <w:proofErr w:type="spellEnd"/>
+      <w:r>
+        <w:t xml:space="preserve">. Iske </w:t>
+      </w:r>
+      <w:proofErr w:type="spellStart"/>
+      <w:r>
+        <w:t>liye</w:t>
+      </w:r>
+      <w:proofErr w:type="spellEnd"/>
+      <w:r>
+        <w:t xml:space="preserve"> CREATE DATABASE command use </w:t>
+      </w:r>
+      <w:proofErr w:type="spellStart"/>
+      <w:r>
+        <w:t>hoti</w:t>
+      </w:r>
+      <w:proofErr w:type="spellEnd"/>
+      <w:r>
+        <w:t xml:space="preserve"> </w:t>
+      </w:r>
+      <w:proofErr w:type="spellStart"/>
+      <w:r>
+        <w:t>hai</w:t>
+      </w:r>
+      <w:proofErr w:type="spellEnd"/>
+      <w:r>
+        <w:t>.</w:t>
+      </w:r>
+    </w:p>
+    <w:p>
+      <w:r>
+        <w:lastRenderedPageBreak/>
+        <w:t xml:space="preserve">        </w:t>
+      </w:r>
+      <w:r>
+        <w:drawing>
+          <wp:inline distT="0" distB="0" distL="0" distR="0" wp14:anchorId="6507FB8D" wp14:editId="30E11AA9">
+            <wp:extent cx="4868687" cy="4273236"/>
+            <wp:effectExtent l="0" t="0" r="8255" b="0"/>
+            <wp:docPr id="1129711" name="Picture 1"/>
+            <wp:cNvGraphicFramePr>
+              <a:graphicFrameLocks xmlns:a="http://schemas.openxmlformats.org/drawingml/2006/main" noChangeAspect="1"/>
+            </wp:cNvGraphicFramePr>
+            <a:graphic xmlns:a="http://schemas.openxmlformats.org/drawingml/2006/main">
+              <a:graphicData uri="http://schemas.openxmlformats.org/drawingml/2006/picture">
+                <pic:pic xmlns:pic="http://schemas.openxmlformats.org/drawingml/2006/picture">
+                  <pic:nvPicPr>
+                    <pic:cNvPr id="1129711" name=""/>
+                    <pic:cNvPicPr/>
+                  </pic:nvPicPr>
+                  <pic:blipFill>
+                    <a:blip r:embed="rId17"/>
+                    <a:stretch>
+                      <a:fillRect/>
+                    </a:stretch>
+                  </pic:blipFill>
+                  <pic:spPr>
+                    <a:xfrm>
+                      <a:off x="0" y="0"/>
+                      <a:ext cx="4873408" cy="4277379"/>
+                    </a:xfrm>
+                    <a:prstGeom prst="rect">
+                      <a:avLst/>
+                    </a:prstGeom>
+                  </pic:spPr>
+                </pic:pic>
+              </a:graphicData>
+            </a:graphic>
+          </wp:inline>
+        </w:drawing>
+      </w:r>
+    </w:p>
+    <w:p>
+      <w:r>
+        <w:t xml:space="preserve">           </w:t>
+      </w:r>
+      <w:r>
+        <w:drawing>
+          <wp:inline distT="0" distB="0" distL="0" distR="0" wp14:anchorId="6AE11D1F" wp14:editId="59272147">
+            <wp:extent cx="4740051" cy="1348857"/>
+            <wp:effectExtent l="0" t="0" r="3810" b="3810"/>
+            <wp:docPr id="57249775" name="Picture 1"/>
+            <wp:cNvGraphicFramePr>
+              <a:graphicFrameLocks xmlns:a="http://schemas.openxmlformats.org/drawingml/2006/main" noChangeAspect="1"/>
+            </wp:cNvGraphicFramePr>
+            <a:graphic xmlns:a="http://schemas.openxmlformats.org/drawingml/2006/main">
+              <a:graphicData uri="http://schemas.openxmlformats.org/drawingml/2006/picture">
+                <pic:pic xmlns:pic="http://schemas.openxmlformats.org/drawingml/2006/picture">
+                  <pic:nvPicPr>
+                    <pic:cNvPr id="57249775" name=""/>
+                    <pic:cNvPicPr/>
+                  </pic:nvPicPr>
+                  <pic:blipFill>
+                    <a:blip r:embed="rId18"/>
+                    <a:stretch>
+                      <a:fillRect/>
+                    </a:stretch>
+                  </pic:blipFill>
+                  <pic:spPr>
+                    <a:xfrm>
+                      <a:off x="0" y="0"/>
+                      <a:ext cx="4740051" cy="1348857"/>
+                    </a:xfrm>
+                    <a:prstGeom prst="rect">
+                      <a:avLst/>
+                    </a:prstGeom>
+                  </pic:spPr>
+                </pic:pic>
+              </a:graphicData>
+            </a:graphic>
+          </wp:inline>
+        </w:drawing>
+      </w:r>
+    </w:p>
+    <w:p>
+      <w:r>
+        <w:t xml:space="preserve">   </w:t>
+      </w:r>
+      <w:r>
+        <w:drawing>
+          <wp:inline distT="0" distB="0" distL="0" distR="0" wp14:anchorId="7D47FF22" wp14:editId="4E13B389">
+            <wp:extent cx="5425910" cy="2636748"/>
+            <wp:effectExtent l="0" t="0" r="3810" b="0"/>
+            <wp:docPr id="2122582264" name="Picture 1"/>
+            <wp:cNvGraphicFramePr>
+              <a:graphicFrameLocks xmlns:a="http://schemas.openxmlformats.org/drawingml/2006/main" noChangeAspect="1"/>
+            </wp:cNvGraphicFramePr>
+            <a:graphic xmlns:a="http://schemas.openxmlformats.org/drawingml/2006/main">
+              <a:graphicData uri="http://schemas.openxmlformats.org/drawingml/2006/picture">
+                <pic:pic xmlns:pic="http://schemas.openxmlformats.org/drawingml/2006/picture">
+                  <pic:nvPicPr>
+                    <pic:cNvPr id="2122582264" name=""/>
+                    <pic:cNvPicPr/>
+                  </pic:nvPicPr>
+                  <pic:blipFill>
+                    <a:blip r:embed="rId19"/>
+                    <a:stretch>
+                      <a:fillRect/>
+                    </a:stretch>
+                  </pic:blipFill>
+                  <pic:spPr>
+                    <a:xfrm>
+                      <a:off x="0" y="0"/>
+                      <a:ext cx="5425910" cy="2636748"/>
+                    </a:xfrm>
+                    <a:prstGeom prst="rect">
+                      <a:avLst/>
+                    </a:prstGeom>
+                  </pic:spPr>
+                </pic:pic>
+              </a:graphicData>
+            </a:graphic>
+          </wp:inline>
+        </w:drawing>
+      </w:r>
+    </w:p>
+    <w:p/>
+    <w:p>
+      <w:r>
+        <w:lastRenderedPageBreak/>
+        <w:t># MYSQL WORKBENCH DARK THEME??</w:t>
+      </w:r>
+    </w:p>
+    <w:p>
+      <w:r>
+        <w:t xml:space="preserve">       </w:t>
+      </w:r>
+      <w:r>
+        <w:drawing>
+          <wp:inline distT="0" distB="0" distL="0" distR="0" wp14:anchorId="655048A3" wp14:editId="53FF8528">
+            <wp:extent cx="5204911" cy="4587638"/>
+            <wp:effectExtent l="0" t="0" r="0" b="3810"/>
+            <wp:docPr id="1395954294" name="Picture 1"/>
+            <wp:cNvGraphicFramePr>
+              <a:graphicFrameLocks xmlns:a="http://schemas.openxmlformats.org/drawingml/2006/main" noChangeAspect="1"/>
+            </wp:cNvGraphicFramePr>
+            <a:graphic xmlns:a="http://schemas.openxmlformats.org/drawingml/2006/main">
+              <a:graphicData uri="http://schemas.openxmlformats.org/drawingml/2006/picture">
+                <pic:pic xmlns:pic="http://schemas.openxmlformats.org/drawingml/2006/picture">
+                  <pic:nvPicPr>
+                    <pic:cNvPr id="1395954294" name=""/>
+                    <pic:cNvPicPr/>
+                  </pic:nvPicPr>
+                  <pic:blipFill>
+                    <a:blip r:embed="rId20"/>
+                    <a:stretch>
+                      <a:fillRect/>
+                    </a:stretch>
+                  </pic:blipFill>
+                  <pic:spPr>
+                    <a:xfrm>
+                      <a:off x="0" y="0"/>
+                      <a:ext cx="5204911" cy="4587638"/>
+                    </a:xfrm>
+                    <a:prstGeom prst="rect">
+                      <a:avLst/>
+                    </a:prstGeom>
+                  </pic:spPr>
+                </pic:pic>
+              </a:graphicData>
+            </a:graphic>
+          </wp:inline>
+        </w:drawing>
+      </w:r>
+    </w:p>
+    <w:p>
+      <w:r>
+        <w:drawing>
+          <wp:inline distT="0" distB="0" distL="0" distR="0" wp14:anchorId="502ECB03" wp14:editId="420FC985">
+            <wp:extent cx="5731510" cy="3223895"/>
+            <wp:effectExtent l="0" t="0" r="2540" b="0"/>
+            <wp:docPr id="1016435349" name="Picture 1"/>
+            <wp:cNvGraphicFramePr>
+              <a:graphicFrameLocks xmlns:a="http://schemas.openxmlformats.org/drawingml/2006/main" noChangeAspect="1"/>
+            </wp:cNvGraphicFramePr>
+            <a:graphic xmlns:a="http://schemas.openxmlformats.org/drawingml/2006/main">
+              <a:graphicData uri="http://schemas.openxmlformats.org/drawingml/2006/picture">
+                <pic:pic xmlns:pic="http://schemas.openxmlformats.org/drawingml/2006/picture">
+                  <pic:nvPicPr>
+                    <pic:cNvPr id="1016435349" name=""/>
+                    <pic:cNvPicPr/>
+                  </pic:nvPicPr>
+                  <pic:blipFill>
+                    <a:blip r:embed="rId21"/>
+                    <a:stretch>
+                      <a:fillRect/>
+                    </a:stretch>
+                  </pic:blipFill>
+                  <pic:spPr>
+                    <a:xfrm>
+                      <a:off x="0" y="0"/>
+                      <a:ext cx="5731510" cy="3223895"/>
+                    </a:xfrm>
+                    <a:prstGeom prst="rect">
+                      <a:avLst/>
+                    </a:prstGeom>
+                  </pic:spPr>
+                </pic:pic>
+              </a:graphicData>
+            </a:graphic>
+          </wp:inline>
+        </w:drawing>
+      </w:r>
+    </w:p>
+    <w:p>
+      <w:r>
+        <w:lastRenderedPageBreak/>
+        <w:t xml:space="preserve">             </w:t>
+      </w:r>
+      <w:r>
+        <w:drawing>
+          <wp:inline distT="0" distB="0" distL="0" distR="0" wp14:anchorId="5A147160" wp14:editId="5D4E4B83">
+            <wp:extent cx="4991533" cy="3063505"/>
+            <wp:effectExtent l="0" t="0" r="0" b="3810"/>
+            <wp:docPr id="1738446841" name="Picture 1"/>
+            <wp:cNvGraphicFramePr>
+              <a:graphicFrameLocks xmlns:a="http://schemas.openxmlformats.org/drawingml/2006/main" noChangeAspect="1"/>
+            </wp:cNvGraphicFramePr>
+            <a:graphic xmlns:a="http://schemas.openxmlformats.org/drawingml/2006/main">
+              <a:graphicData uri="http://schemas.openxmlformats.org/drawingml/2006/picture">
+                <pic:pic xmlns:pic="http://schemas.openxmlformats.org/drawingml/2006/picture">
+                  <pic:nvPicPr>
+                    <pic:cNvPr id="1738446841" name=""/>
+                    <pic:cNvPicPr/>
+                  </pic:nvPicPr>
+                  <pic:blipFill>
+                    <a:blip r:embed="rId22"/>
+                    <a:stretch>
+                      <a:fillRect/>
+                    </a:stretch>
+                  </pic:blipFill>
+                  <pic:spPr>
+                    <a:xfrm>
+                      <a:off x="0" y="0"/>
+                      <a:ext cx="4991533" cy="3063505"/>
+                    </a:xfrm>
+                    <a:prstGeom prst="rect">
+                      <a:avLst/>
+                    </a:prstGeom>
+                  </pic:spPr>
+                </pic:pic>
+              </a:graphicData>
+            </a:graphic>
+          </wp:inline>
+        </w:drawing>
+      </w:r>
+    </w:p>
+    <w:p>
+      <w:r>
+        <w:drawing>
+          <wp:inline distT="0" distB="0" distL="0" distR="0" wp14:anchorId="1D3457EA" wp14:editId="32802FF5">
+            <wp:extent cx="5731510" cy="1805940"/>
+            <wp:effectExtent l="0" t="0" r="2540" b="3810"/>
+            <wp:docPr id="1064310901" name="Picture 1"/>
+            <wp:cNvGraphicFramePr>
+              <a:graphicFrameLocks xmlns:a="http://schemas.openxmlformats.org/drawingml/2006/main" noChangeAspect="1"/>
+            </wp:cNvGraphicFramePr>
+            <a:graphic xmlns:a="http://schemas.openxmlformats.org/drawingml/2006/main">
+              <a:graphicData uri="http://schemas.openxmlformats.org/drawingml/2006/picture">
+                <pic:pic xmlns:pic="http://schemas.openxmlformats.org/drawingml/2006/picture">
+                  <pic:nvPicPr>
+                    <pic:cNvPr id="1064310901" name=""/>
+                    <pic:cNvPicPr/>
+                  </pic:nvPicPr>
+                  <pic:blipFill>
+                    <a:blip r:embed="rId23"/>
+                    <a:stretch>
+                      <a:fillRect/>
+                    </a:stretch>
+                  </pic:blipFill>
+                  <pic:spPr>
+                    <a:xfrm>
+                      <a:off x="0" y="0"/>
+                      <a:ext cx="5731510" cy="1805940"/>
+                    </a:xfrm>
+                    <a:prstGeom prst="rect">
+                      <a:avLst/>
+                    </a:prstGeom>
+                  </pic:spPr>
+                </pic:pic>
+              </a:graphicData>
+            </a:graphic>
+          </wp:inline>
+        </w:drawing>
+      </w:r>
+    </w:p>
+    <w:p>
+      <w:pPr>
+        <w:rPr>
+          <w:b/>
+          <w:bCs/>
+          <w:sz w:val="28"/>
+          <w:szCs w:val="28"/>
+        </w:rPr>
+      </w:pPr>
+      <w:r>
+        <w:rPr>
+          <w:b/>
+          <w:bCs/>
+          <w:sz w:val="28"/>
+          <w:szCs w:val="28"/>
+        </w:rPr>
+        <w:t xml:space="preserve"># </w:t>
+      </w:r>
+      <w:r>
+        <w:rPr>
+          <w:b/>
+          <w:bCs/>
+          <w:sz w:val="28"/>
+          <w:szCs w:val="28"/>
+          <w:u w:val="single"/>
+        </w:rPr>
+        <w:t>WHY IF NOT EXISTS?? -&gt; IF SAME NAME DB EXISTS ALREADY!!</w:t>
+      </w:r>
+    </w:p>
+    <w:p>
+      <w:r>
+        <w:t xml:space="preserve">              </w:t>
+      </w:r>
+      <w:r>
+        <w:drawing>
+          <wp:inline distT="0" distB="0" distL="0" distR="0" wp14:anchorId="7CE9A763" wp14:editId="70981069">
+            <wp:extent cx="4744016" cy="3167413"/>
+            <wp:effectExtent l="0" t="0" r="0" b="0"/>
+            <wp:docPr id="1829786167" name="Picture 1"/>
+            <wp:cNvGraphicFramePr>
+              <a:graphicFrameLocks xmlns:a="http://schemas.openxmlformats.org/drawingml/2006/main" noChangeAspect="1"/>
+            </wp:cNvGraphicFramePr>
+            <a:graphic xmlns:a="http://schemas.openxmlformats.org/drawingml/2006/main">
+              <a:graphicData uri="http://schemas.openxmlformats.org/drawingml/2006/picture">
+                <pic:pic xmlns:pic="http://schemas.openxmlformats.org/drawingml/2006/picture">
+                  <pic:nvPicPr>
+                    <pic:cNvPr id="1829786167" name=""/>
+                    <pic:cNvPicPr/>
+                  </pic:nvPicPr>
+                  <pic:blipFill>
+                    <a:blip r:embed="rId24"/>
+                    <a:stretch>
+                      <a:fillRect/>
+                    </a:stretch>
+                  </pic:blipFill>
+                  <pic:spPr>
+                    <a:xfrm>
+                      <a:off x="0" y="0"/>
+                      <a:ext cx="4746136" cy="3168829"/>
+                    </a:xfrm>
+                    <a:prstGeom prst="rect">
+                      <a:avLst/>
+                    </a:prstGeom>
+                  </pic:spPr>
+                </pic:pic>
+              </a:graphicData>
+            </a:graphic>
+          </wp:inline>
+        </w:drawing>
+      </w:r>
+    </w:p>
+    <w:p>
+      <w:r>
+        <w:lastRenderedPageBreak/>
+        <w:drawing>
+          <wp:inline distT="0" distB="0" distL="0" distR="0" wp14:anchorId="19C97526" wp14:editId="61946CDC">
+            <wp:extent cx="5731510" cy="1461770"/>
+            <wp:effectExtent l="0" t="0" r="2540" b="5080"/>
+            <wp:docPr id="14216574" name="Picture 1"/>
+            <wp:cNvGraphicFramePr>
+              <a:graphicFrameLocks xmlns:a="http://schemas.openxmlformats.org/drawingml/2006/main" noChangeAspect="1"/>
+            </wp:cNvGraphicFramePr>
+            <a:graphic xmlns:a="http://schemas.openxmlformats.org/drawingml/2006/main">
+              <a:graphicData uri="http://schemas.openxmlformats.org/drawingml/2006/picture">
+                <pic:pic xmlns:pic="http://schemas.openxmlformats.org/drawingml/2006/picture">
+                  <pic:nvPicPr>
+                    <pic:cNvPr id="14216574" name=""/>
+                    <pic:cNvPicPr/>
+                  </pic:nvPicPr>
+                  <pic:blipFill>
+                    <a:blip r:embed="rId25"/>
+                    <a:stretch>
+                      <a:fillRect/>
+                    </a:stretch>
+                  </pic:blipFill>
+                  <pic:spPr>
+                    <a:xfrm>
+                      <a:off x="0" y="0"/>
+                      <a:ext cx="5731510" cy="1461770"/>
+                    </a:xfrm>
+                    <a:prstGeom prst="rect">
+                      <a:avLst/>
+                    </a:prstGeom>
+                  </pic:spPr>
+                </pic:pic>
+              </a:graphicData>
+            </a:graphic>
+          </wp:inline>
+        </w:drawing>
+      </w:r>
+    </w:p>
+    <w:p>
+      <w:pPr>
+        <w:rPr>
+          <w:b/>
+          <w:bCs/>
+        </w:rPr>
+      </w:pPr>
+      <w:r>
+        <w:rPr>
+          <w:b/>
+          <w:bCs/>
+        </w:rPr>
+        <w:t xml:space="preserve">2. Sare Databases </w:t>
+      </w:r>
+      <w:proofErr w:type="spellStart"/>
+      <w:r>
+        <w:rPr>
+          <w:b/>
+          <w:bCs/>
+        </w:rPr>
+        <w:t>dekhna</w:t>
+      </w:r>
+      <w:proofErr w:type="spellEnd"/>
+      <w:r>
+        <w:rPr>
+          <w:b/>
+          <w:bCs/>
+        </w:rPr>
+        <w:t xml:space="preserve"> (SHOW DATABASES)</w:t>
+      </w:r>
+    </w:p>
+    <w:p>
+      <w:r>
+        <w:t xml:space="preserve">Agar </w:t>
+      </w:r>
+      <w:proofErr w:type="spellStart"/>
+      <w:r>
+        <w:t>tumhare</w:t>
+      </w:r>
+      <w:proofErr w:type="spellEnd"/>
+      <w:r>
+        <w:t xml:space="preserve"> server par </w:t>
+      </w:r>
+      <w:proofErr w:type="spellStart"/>
+      <w:r>
+        <w:t>kitne</w:t>
+      </w:r>
+      <w:proofErr w:type="spellEnd"/>
+      <w:r>
+        <w:t xml:space="preserve"> databases bane hain, yeh check </w:t>
+      </w:r>
+      <w:proofErr w:type="spellStart"/>
+      <w:r>
+        <w:t>karna</w:t>
+      </w:r>
+      <w:proofErr w:type="spellEnd"/>
+      <w:r>
+        <w:t xml:space="preserve"> </w:t>
+      </w:r>
+      <w:proofErr w:type="spellStart"/>
+      <w:r>
+        <w:t>ho</w:t>
+      </w:r>
+      <w:proofErr w:type="spellEnd"/>
+      <w:r>
+        <w:t xml:space="preserve">, </w:t>
+      </w:r>
+      <w:proofErr w:type="spellStart"/>
+      <w:r>
+        <w:t>toh</w:t>
+      </w:r>
+      <w:proofErr w:type="spellEnd"/>
+      <w:r>
+        <w:t xml:space="preserve"> yeh command use </w:t>
+      </w:r>
+      <w:proofErr w:type="spellStart"/>
+      <w:r>
+        <w:t>hoti</w:t>
+      </w:r>
+      <w:proofErr w:type="spellEnd"/>
+      <w:r>
+        <w:t xml:space="preserve"> </w:t>
+      </w:r>
+      <w:proofErr w:type="spellStart"/>
+      <w:r>
+        <w:t>hai</w:t>
+      </w:r>
+      <w:proofErr w:type="spellEnd"/>
+      <w:r>
+        <w:t>:</w:t>
+      </w:r>
+    </w:p>
+    <w:p>
+      <w:r>
+        <w:t xml:space="preserve">            </w:t>
+      </w:r>
+      <w:r>
+        <w:drawing>
+          <wp:inline distT="0" distB="0" distL="0" distR="0" wp14:anchorId="1D7B4721" wp14:editId="1D647603">
+            <wp:extent cx="4854361" cy="1562235"/>
+            <wp:effectExtent l="0" t="0" r="3810" b="0"/>
+            <wp:docPr id="63347491" name="Picture 1"/>
+            <wp:cNvGraphicFramePr>
+              <a:graphicFrameLocks xmlns:a="http://schemas.openxmlformats.org/drawingml/2006/main" noChangeAspect="1"/>
+            </wp:cNvGraphicFramePr>
+            <a:graphic xmlns:a="http://schemas.openxmlformats.org/drawingml/2006/main">
+              <a:graphicData uri="http://schemas.openxmlformats.org/drawingml/2006/picture">
+                <pic:pic xmlns:pic="http://schemas.openxmlformats.org/drawingml/2006/picture">
+                  <pic:nvPicPr>
+                    <pic:cNvPr id="63347491" name=""/>
+                    <pic:cNvPicPr/>
+                  </pic:nvPicPr>
+                  <pic:blipFill>
+                    <a:blip r:embed="rId26"/>
+                    <a:stretch>
+                      <a:fillRect/>
+                    </a:stretch>
+                  </pic:blipFill>
+                  <pic:spPr>
+                    <a:xfrm>
+                      <a:off x="0" y="0"/>
+                      <a:ext cx="4854361" cy="1562235"/>
+                    </a:xfrm>
+                    <a:prstGeom prst="rect">
+                      <a:avLst/>
+                    </a:prstGeom>
+                  </pic:spPr>
+                </pic:pic>
+              </a:graphicData>
+            </a:graphic>
+          </wp:inline>
+        </w:drawing>
+      </w:r>
+    </w:p>
+    <w:p>
+      <w:r>
+        <w:drawing>
+          <wp:inline distT="0" distB="0" distL="0" distR="0" wp14:anchorId="47BF9FB4" wp14:editId="103DCE80">
+            <wp:extent cx="5731510" cy="2278380"/>
+            <wp:effectExtent l="0" t="0" r="2540" b="7620"/>
+            <wp:docPr id="1105620799" name="Picture 1"/>
+            <wp:cNvGraphicFramePr>
+              <a:graphicFrameLocks xmlns:a="http://schemas.openxmlformats.org/drawingml/2006/main" noChangeAspect="1"/>
+            </wp:cNvGraphicFramePr>
+            <a:graphic xmlns:a="http://schemas.openxmlformats.org/drawingml/2006/main">
+              <a:graphicData uri="http://schemas.openxmlformats.org/drawingml/2006/picture">
+                <pic:pic xmlns:pic="http://schemas.openxmlformats.org/drawingml/2006/picture">
+                  <pic:nvPicPr>
+                    <pic:cNvPr id="1105620799" name=""/>
+                    <pic:cNvPicPr/>
+                  </pic:nvPicPr>
+                  <pic:blipFill>
+                    <a:blip r:embed="rId27"/>
+                    <a:stretch>
+                      <a:fillRect/>
+                    </a:stretch>
+                  </pic:blipFill>
+                  <pic:spPr>
+                    <a:xfrm>
+                      <a:off x="0" y="0"/>
+                      <a:ext cx="5731510" cy="2278380"/>
+                    </a:xfrm>
+                    <a:prstGeom prst="rect">
+                      <a:avLst/>
+                    </a:prstGeom>
+                  </pic:spPr>
+                </pic:pic>
+              </a:graphicData>
+            </a:graphic>
+          </wp:inline>
+        </w:drawing>
+      </w:r>
+    </w:p>
+    <w:p/>
+    <w:p>
+      <w:pPr>
+        <w:rPr>
+          <w:b/>
+          <w:bCs/>
+        </w:rPr>
+      </w:pPr>
+      <w:r>
+        <w:rPr>
+          <w:b/>
+          <w:bCs/>
+        </w:rPr>
+        <w:t xml:space="preserve">3. Database </w:t>
+      </w:r>
+      <w:proofErr w:type="spellStart"/>
+      <w:r>
+        <w:rPr>
+          <w:b/>
+          <w:bCs/>
+        </w:rPr>
+        <w:t>ke</w:t>
+      </w:r>
+      <w:proofErr w:type="spellEnd"/>
+      <w:r>
+        <w:rPr>
+          <w:b/>
+          <w:bCs/>
+        </w:rPr>
+        <w:t xml:space="preserve"> </w:t>
+      </w:r>
+      <w:proofErr w:type="spellStart"/>
+      <w:r>
+        <w:rPr>
+          <w:b/>
+          <w:bCs/>
+        </w:rPr>
+        <w:t>andar</w:t>
+      </w:r>
+      <w:proofErr w:type="spellEnd"/>
+      <w:r>
+        <w:rPr>
+          <w:b/>
+          <w:bCs/>
+        </w:rPr>
+        <w:t xml:space="preserve"> </w:t>
+      </w:r>
+      <w:proofErr w:type="spellStart"/>
+      <w:r>
+        <w:rPr>
+          <w:b/>
+          <w:bCs/>
+        </w:rPr>
+        <w:t>ghusna</w:t>
+      </w:r>
+      <w:proofErr w:type="spellEnd"/>
+      <w:r>
+        <w:rPr>
+          <w:b/>
+          <w:bCs/>
+        </w:rPr>
+        <w:t xml:space="preserve"> (USE)</w:t>
+      </w:r>
+    </w:p>
+    <w:p>
+      <w:r>
+        <w:t xml:space="preserve">Server </w:t>
+      </w:r>
+      <w:proofErr w:type="spellStart"/>
+      <w:r>
+        <w:t>ke</w:t>
+      </w:r>
+      <w:proofErr w:type="spellEnd"/>
+      <w:r>
+        <w:t xml:space="preserve"> </w:t>
+      </w:r>
+      <w:proofErr w:type="spellStart"/>
+      <w:r>
+        <w:t>paas</w:t>
+      </w:r>
+      <w:proofErr w:type="spellEnd"/>
+      <w:r>
+        <w:t xml:space="preserve"> </w:t>
+      </w:r>
+      <w:proofErr w:type="spellStart"/>
+      <w:r>
+        <w:t>bohot</w:t>
+      </w:r>
+      <w:proofErr w:type="spellEnd"/>
+      <w:r>
+        <w:t xml:space="preserve"> </w:t>
+      </w:r>
+      <w:proofErr w:type="spellStart"/>
+      <w:r>
+        <w:t>sare</w:t>
+      </w:r>
+      <w:proofErr w:type="spellEnd"/>
+      <w:r>
+        <w:t xml:space="preserve"> databases </w:t>
+      </w:r>
+      <w:proofErr w:type="spellStart"/>
+      <w:r>
+        <w:t>ho</w:t>
+      </w:r>
+      <w:proofErr w:type="spellEnd"/>
+      <w:r>
+        <w:t xml:space="preserve"> </w:t>
+      </w:r>
+      <w:proofErr w:type="spellStart"/>
+      <w:r>
+        <w:t>sakte</w:t>
+      </w:r>
+      <w:proofErr w:type="spellEnd"/>
+      <w:r>
+        <w:t xml:space="preserve"> hain. Jab tum </w:t>
+      </w:r>
+      <w:proofErr w:type="spellStart"/>
+      <w:r>
+        <w:t>naya</w:t>
+      </w:r>
+      <w:proofErr w:type="spellEnd"/>
+      <w:r>
+        <w:t xml:space="preserve"> table banana </w:t>
+      </w:r>
+      <w:proofErr w:type="spellStart"/>
+      <w:r>
+        <w:t>chaho</w:t>
+      </w:r>
+      <w:proofErr w:type="spellEnd"/>
+      <w:r>
+        <w:t xml:space="preserve"> </w:t>
+      </w:r>
+      <w:proofErr w:type="spellStart"/>
+      <w:r>
+        <w:t>ya</w:t>
+      </w:r>
+      <w:proofErr w:type="spellEnd"/>
+      <w:r>
+        <w:t xml:space="preserve"> data </w:t>
+      </w:r>
+      <w:proofErr w:type="spellStart"/>
+      <w:r>
+        <w:t>dalna</w:t>
+      </w:r>
+      <w:proofErr w:type="spellEnd"/>
+      <w:r>
+        <w:t xml:space="preserve"> </w:t>
+      </w:r>
+      <w:proofErr w:type="spellStart"/>
+      <w:r>
+        <w:t>chaho</w:t>
+      </w:r>
+      <w:proofErr w:type="spellEnd"/>
+      <w:r>
+        <w:t xml:space="preserve">, </w:t>
+      </w:r>
+      <w:proofErr w:type="spellStart"/>
+      <w:r>
+        <w:t>toh</w:t>
+      </w:r>
+      <w:proofErr w:type="spellEnd"/>
+      <w:r>
+        <w:t xml:space="preserve"> server ko </w:t>
+      </w:r>
+      <w:proofErr w:type="spellStart"/>
+      <w:r>
+        <w:t>kaise</w:t>
+      </w:r>
+      <w:proofErr w:type="spellEnd"/>
+      <w:r>
+        <w:t xml:space="preserve"> </w:t>
+      </w:r>
+      <w:proofErr w:type="spellStart"/>
+      <w:r>
+        <w:t>pata</w:t>
+      </w:r>
+      <w:proofErr w:type="spellEnd"/>
+      <w:r>
+        <w:t xml:space="preserve"> </w:t>
+      </w:r>
+      <w:proofErr w:type="spellStart"/>
+      <w:r>
+        <w:t>chalega</w:t>
+      </w:r>
+      <w:proofErr w:type="spellEnd"/>
+      <w:r>
+        <w:t xml:space="preserve"> ki tum </w:t>
+      </w:r>
+      <w:proofErr w:type="spellStart"/>
+      <w:r>
+        <w:t>kis</w:t>
+      </w:r>
+      <w:proofErr w:type="spellEnd"/>
+      <w:r>
+        <w:t xml:space="preserve"> database </w:t>
+      </w:r>
+      <w:proofErr w:type="spellStart"/>
+      <w:r>
+        <w:t>mein</w:t>
+      </w:r>
+      <w:proofErr w:type="spellEnd"/>
+      <w:r>
+        <w:t xml:space="preserve"> </w:t>
+      </w:r>
+      <w:proofErr w:type="spellStart"/>
+      <w:r>
+        <w:t>kaam</w:t>
+      </w:r>
+      <w:proofErr w:type="spellEnd"/>
+      <w:r>
+        <w:t xml:space="preserve"> </w:t>
+      </w:r>
+      <w:proofErr w:type="spellStart"/>
+      <w:r>
+        <w:t>karna</w:t>
+      </w:r>
+      <w:proofErr w:type="spellEnd"/>
+      <w:r>
+        <w:t xml:space="preserve"> </w:t>
+      </w:r>
+      <w:proofErr w:type="spellStart"/>
+      <w:r>
+        <w:t>chahte</w:t>
+      </w:r>
+      <w:proofErr w:type="spellEnd"/>
+      <w:r>
+        <w:t xml:space="preserve"> </w:t>
+      </w:r>
+      <w:proofErr w:type="spellStart"/>
+      <w:r>
+        <w:t>ho</w:t>
+      </w:r>
+      <w:proofErr w:type="spellEnd"/>
+      <w:r>
+        <w:t xml:space="preserve">? Iske </w:t>
+      </w:r>
+      <w:proofErr w:type="spellStart"/>
+      <w:r>
+        <w:t>liye</w:t>
+      </w:r>
+      <w:proofErr w:type="spellEnd"/>
+      <w:r>
+        <w:t xml:space="preserve"> hum USE command se database ko select </w:t>
+      </w:r>
+      <w:proofErr w:type="spellStart"/>
+      <w:r>
+        <w:t>karte</w:t>
+      </w:r>
+      <w:proofErr w:type="spellEnd"/>
+      <w:r>
+        <w:t xml:space="preserve"> hain:</w:t>
+      </w:r>
+    </w:p>
+    <w:p/>
+    <w:p/>
+    <w:p/>
+    <w:p/>
+    <w:p/>
+    <w:p>
+      <w:pPr>
+        <w:tabs>
+          <w:tab w:val="right" w:pos="9026"/>
+        </w:tabs>
+      </w:pPr>
+      <w:r>
+        <w:t xml:space="preserve">              </w:t>
+      </w:r>
+      <w:r>
+        <w:drawing>
+          <wp:inline distT="0" distB="0" distL="0" distR="0" wp14:anchorId="1E4F180D" wp14:editId="5B5A6FCE">
+            <wp:extent cx="4877223" cy="1455546"/>
+            <wp:effectExtent l="0" t="0" r="0" b="0"/>
+            <wp:docPr id="791677940" name="Picture 1"/>
+            <wp:cNvGraphicFramePr>
+              <a:graphicFrameLocks xmlns:a="http://schemas.openxmlformats.org/drawingml/2006/main" noChangeAspect="1"/>
+            </wp:cNvGraphicFramePr>
+            <a:graphic xmlns:a="http://schemas.openxmlformats.org/drawingml/2006/main">
+              <a:graphicData uri="http://schemas.openxmlformats.org/drawingml/2006/picture">
+                <pic:pic xmlns:pic="http://schemas.openxmlformats.org/drawingml/2006/picture">
+                  <pic:nvPicPr>
+                    <pic:cNvPr id="791677940" name=""/>
+                    <pic:cNvPicPr/>
+                  </pic:nvPicPr>
+                  <pic:blipFill>
+                    <a:blip r:embed="rId28"/>
+                    <a:stretch>
+                      <a:fillRect/>
+                    </a:stretch>
+                  </pic:blipFill>
+                  <pic:spPr>
+                    <a:xfrm>
+                      <a:off x="0" y="0"/>
+                      <a:ext cx="4877223" cy="1455546"/>
+                    </a:xfrm>
+                    <a:prstGeom prst="rect">
+                      <a:avLst/>
+                    </a:prstGeom>
+                  </pic:spPr>
+                </pic:pic>
+              </a:graphicData>
+            </a:graphic>
+          </wp:inline>
+        </w:drawing>
+      </w:r>
+      <w:r>
+        <w:tab/>
+      </w:r>
+    </w:p>
+    <w:p>
+      <w:pPr>
+        <w:tabs>
+          <w:tab w:val="right" w:pos="9026"/>
+        </w:tabs>
+      </w:pPr>
+    </w:p>
+    <w:p>
+      <w:pPr>
+        <w:tabs>
+          <w:tab w:val="right" w:pos="9026"/>
+        </w:tabs>
+      </w:pPr>
+    </w:p>
+    <w:p>
+      <w:pPr>
+        <w:tabs>
+          <w:tab w:val="right" w:pos="9026"/>
+        </w:tabs>
+      </w:pPr>
+    </w:p>
+    <w:p>
+      <w:r>
+        <w:drawing>
+          <wp:inline distT="0" distB="0" distL="0" distR="0" wp14:anchorId="3B4B43FD" wp14:editId="2451F708">
+            <wp:extent cx="5731510" cy="3620135"/>
+            <wp:effectExtent l="0" t="0" r="2540" b="0"/>
+            <wp:docPr id="1951979207" name="Picture 1"/>
+            <wp:cNvGraphicFramePr>
+              <a:graphicFrameLocks xmlns:a="http://schemas.openxmlformats.org/drawingml/2006/main" noChangeAspect="1"/>
+            </wp:cNvGraphicFramePr>
+            <a:graphic xmlns:a="http://schemas.openxmlformats.org/drawingml/2006/main">
+              <a:graphicData uri="http://schemas.openxmlformats.org/drawingml/2006/picture">
+                <pic:pic xmlns:pic="http://schemas.openxmlformats.org/drawingml/2006/picture">
+                  <pic:nvPicPr>
+                    <pic:cNvPr id="1951979207" name=""/>
+                    <pic:cNvPicPr/>
+                  </pic:nvPicPr>
+                  <pic:blipFill>
+                    <a:blip r:embed="rId29"/>
+                    <a:stretch>
+                      <a:fillRect/>
+                    </a:stretch>
+                  </pic:blipFill>
+                  <pic:spPr>
+                    <a:xfrm>
+                      <a:off x="0" y="0"/>
+                      <a:ext cx="5731510" cy="3620135"/>
+                    </a:xfrm>
+                    <a:prstGeom prst="rect">
+                      <a:avLst/>
+                    </a:prstGeom>
+                  </pic:spPr>
+                </pic:pic>
+              </a:graphicData>
+            </a:graphic>
+          </wp:inline>
+        </w:drawing>
+      </w:r>
+    </w:p>
+    <w:p/>
+    <w:p>
+      <w:pPr>
+        <w:rPr>
+          <w:b/>
+          <w:bCs/>
+        </w:rPr>
+      </w:pPr>
+      <w:r>
+        <w:rPr>
+          <w:b/>
+          <w:bCs/>
+        </w:rPr>
+        <w:t xml:space="preserve">4. Database ko Delete </w:t>
+      </w:r>
+      <w:proofErr w:type="spellStart"/>
+      <w:r>
+        <w:rPr>
+          <w:b/>
+          <w:bCs/>
+        </w:rPr>
+        <w:t>karna</w:t>
+      </w:r>
+      <w:proofErr w:type="spellEnd"/>
+      <w:r>
+        <w:rPr>
+          <w:b/>
+          <w:bCs/>
+        </w:rPr>
+        <w:t xml:space="preserve"> (DROP DATABASE)</w:t>
+      </w:r>
+    </w:p>
+    <w:p>
+      <w:r>
+        <w:t xml:space="preserve">Agar koi database ab </w:t>
+      </w:r>
+      <w:proofErr w:type="spellStart"/>
+      <w:r>
+        <w:t>kaam</w:t>
+      </w:r>
+      <w:proofErr w:type="spellEnd"/>
+      <w:r>
+        <w:t xml:space="preserve"> ka </w:t>
+      </w:r>
+      <w:proofErr w:type="spellStart"/>
+      <w:r>
+        <w:t>nahi</w:t>
+      </w:r>
+      <w:proofErr w:type="spellEnd"/>
+      <w:r>
+        <w:t xml:space="preserve"> </w:t>
+      </w:r>
+      <w:proofErr w:type="spellStart"/>
+      <w:r>
+        <w:t>hai</w:t>
+      </w:r>
+      <w:proofErr w:type="spellEnd"/>
+      <w:r>
+        <w:t xml:space="preserve"> aur use poori </w:t>
+      </w:r>
+      <w:proofErr w:type="spellStart"/>
+      <w:r>
+        <w:t>tarah</w:t>
+      </w:r>
+      <w:proofErr w:type="spellEnd"/>
+      <w:r>
+        <w:t xml:space="preserve"> se </w:t>
+      </w:r>
+      <w:proofErr w:type="spellStart"/>
+      <w:r>
+        <w:t>hamesha</w:t>
+      </w:r>
+      <w:proofErr w:type="spellEnd"/>
+      <w:r>
+        <w:t xml:space="preserve"> </w:t>
+      </w:r>
+      <w:proofErr w:type="spellStart"/>
+      <w:r>
+        <w:t>ke</w:t>
+      </w:r>
+      <w:proofErr w:type="spellEnd"/>
+      <w:r>
+        <w:t xml:space="preserve"> </w:t>
+      </w:r>
+      <w:proofErr w:type="spellStart"/>
+      <w:r>
+        <w:t>liye</w:t>
+      </w:r>
+      <w:proofErr w:type="spellEnd"/>
+      <w:r>
+        <w:t xml:space="preserve"> </w:t>
+      </w:r>
+      <w:proofErr w:type="spellStart"/>
+      <w:r>
+        <w:t>mitana</w:t>
+      </w:r>
+      <w:proofErr w:type="spellEnd"/>
+      <w:r>
+        <w:t xml:space="preserve"> </w:t>
+      </w:r>
+      <w:proofErr w:type="spellStart"/>
+      <w:r>
+        <w:t>hai</w:t>
+      </w:r>
+      <w:proofErr w:type="spellEnd"/>
+      <w:r>
+        <w:t xml:space="preserve">, </w:t>
+      </w:r>
+      <w:proofErr w:type="spellStart"/>
+      <w:r>
+        <w:t>toh</w:t>
+      </w:r>
+      <w:proofErr w:type="spellEnd"/>
+      <w:r>
+        <w:t xml:space="preserve"> DROP DATABASE command use </w:t>
+      </w:r>
+      <w:proofErr w:type="spellStart"/>
+      <w:r>
+        <w:t>hoti</w:t>
+      </w:r>
+      <w:proofErr w:type="spellEnd"/>
+      <w:r>
+        <w:t xml:space="preserve"> </w:t>
+      </w:r>
+      <w:proofErr w:type="spellStart"/>
+      <w:r>
+        <w:t>hai</w:t>
+      </w:r>
+      <w:proofErr w:type="spellEnd"/>
+      <w:r>
+        <w:t>.</w:t>
+      </w:r>
+    </w:p>
+    <w:p>
+      <w:r>
+        <w:lastRenderedPageBreak/>
+        <w:t xml:space="preserve">               </w:t>
+      </w:r>
+      <w:r>
+        <w:drawing>
+          <wp:inline distT="0" distB="0" distL="0" distR="0" wp14:anchorId="00D91189" wp14:editId="22826AF2">
+            <wp:extent cx="4892464" cy="3475021"/>
+            <wp:effectExtent l="0" t="0" r="3810" b="0"/>
+            <wp:docPr id="711016216" name="Picture 1"/>
+            <wp:cNvGraphicFramePr>
+              <a:graphicFrameLocks xmlns:a="http://schemas.openxmlformats.org/drawingml/2006/main" noChangeAspect="1"/>
+            </wp:cNvGraphicFramePr>
+            <a:graphic xmlns:a="http://schemas.openxmlformats.org/drawingml/2006/main">
+              <a:graphicData uri="http://schemas.openxmlformats.org/drawingml/2006/picture">
+                <pic:pic xmlns:pic="http://schemas.openxmlformats.org/drawingml/2006/picture">
+                  <pic:nvPicPr>
+                    <pic:cNvPr id="711016216" name=""/>
+                    <pic:cNvPicPr/>
+                  </pic:nvPicPr>
+                  <pic:blipFill>
+                    <a:blip r:embed="rId30"/>
+                    <a:stretch>
+                      <a:fillRect/>
+                    </a:stretch>
+                  </pic:blipFill>
+                  <pic:spPr>
+                    <a:xfrm>
+                      <a:off x="0" y="0"/>
+                      <a:ext cx="4892464" cy="3475021"/>
+                    </a:xfrm>
+                    <a:prstGeom prst="rect">
+                      <a:avLst/>
+                    </a:prstGeom>
+                  </pic:spPr>
+                </pic:pic>
+              </a:graphicData>
+            </a:graphic>
+          </wp:inline>
+        </w:drawing>
+      </w:r>
+    </w:p>
+    <w:p>
+      <w:r>
+        <w:drawing>
+          <wp:inline distT="0" distB="0" distL="0" distR="0" wp14:anchorId="1096814A" wp14:editId="6EFF804A">
+            <wp:extent cx="5731510" cy="1955800"/>
+            <wp:effectExtent l="0" t="0" r="2540" b="6350"/>
+            <wp:docPr id="1929764155" name="Picture 1"/>
+            <wp:cNvGraphicFramePr>
+              <a:graphicFrameLocks xmlns:a="http://schemas.openxmlformats.org/drawingml/2006/main" noChangeAspect="1"/>
+            </wp:cNvGraphicFramePr>
+            <a:graphic xmlns:a="http://schemas.openxmlformats.org/drawingml/2006/main">
+              <a:graphicData uri="http://schemas.openxmlformats.org/drawingml/2006/picture">
+                <pic:pic xmlns:pic="http://schemas.openxmlformats.org/drawingml/2006/picture">
+                  <pic:nvPicPr>
+                    <pic:cNvPr id="1929764155" name=""/>
+                    <pic:cNvPicPr/>
+                  </pic:nvPicPr>
+                  <pic:blipFill>
+                    <a:blip r:embed="rId31"/>
+                    <a:stretch>
+                      <a:fillRect/>
+                    </a:stretch>
+                  </pic:blipFill>
+                  <pic:spPr>
+                    <a:xfrm>
+                      <a:off x="0" y="0"/>
+                      <a:ext cx="5731510" cy="1955800"/>
+                    </a:xfrm>
+                    <a:prstGeom prst="rect">
+                      <a:avLst/>
+                    </a:prstGeom>
+                  </pic:spPr>
+                </pic:pic>
+              </a:graphicData>
+            </a:graphic>
+          </wp:inline>
+        </w:drawing>
+      </w:r>
+    </w:p>
+    <w:p>
+      <w:r>
+        <w:rPr>
+          <w:b/>
+          <w:bCs/>
+        </w:rPr>
+        <w:t>Summary Checklist for Chapter L5:</w:t>
+      </w:r>
+    </w:p>
+    <w:p>
+      <w:pPr>
+        <w:numPr>
+          <w:ilvl w:val="0"/>
+          <w:numId w:val="16"/>
+        </w:numPr>
+      </w:pPr>
+      <w:r>
+        <w:t xml:space="preserve">CREATE DATABASE IF NOT EXISTS </w:t>
+      </w:r>
+      <w:proofErr w:type="spellStart"/>
+      <w:r>
+        <w:t>db_name</w:t>
+      </w:r>
+      <w:proofErr w:type="spellEnd"/>
+      <w:r>
+        <w:t>; (Banana)</w:t>
+      </w:r>
+    </w:p>
+    <w:p>
+      <w:pPr>
+        <w:numPr>
+          <w:ilvl w:val="0"/>
+          <w:numId w:val="16"/>
+        </w:numPr>
+      </w:pPr>
+      <w:r>
+        <w:t>SHOW DATABASES; (</w:t>
+      </w:r>
+      <w:proofErr w:type="spellStart"/>
+      <w:r>
+        <w:t>Dekhna</w:t>
+      </w:r>
+      <w:proofErr w:type="spellEnd"/>
+      <w:r>
+        <w:t>)</w:t>
+      </w:r>
+    </w:p>
+    <w:p>
+      <w:pPr>
+        <w:numPr>
+          <w:ilvl w:val="0"/>
+          <w:numId w:val="16"/>
+        </w:numPr>
+      </w:pPr>
+      <w:r>
+        <w:t xml:space="preserve">USE </w:t>
+      </w:r>
+      <w:proofErr w:type="spellStart"/>
+      <w:r>
+        <w:t>db_name</w:t>
+      </w:r>
+      <w:proofErr w:type="spellEnd"/>
+      <w:r>
+        <w:t xml:space="preserve">; (Select </w:t>
+      </w:r>
+      <w:proofErr w:type="spellStart"/>
+      <w:r>
+        <w:t>karna</w:t>
+      </w:r>
+      <w:proofErr w:type="spellEnd"/>
+      <w:r>
+        <w:t>)</w:t>
+      </w:r>
+    </w:p>
+    <w:p>
+      <w:pPr>
+        <w:numPr>
+          <w:ilvl w:val="0"/>
+          <w:numId w:val="16"/>
+        </w:numPr>
+      </w:pPr>
+      <w:r>
+        <w:t xml:space="preserve">DROP DATABASE IF EXISTS </w:t>
+      </w:r>
+      <w:proofErr w:type="spellStart"/>
+      <w:r>
+        <w:t>db_name</w:t>
+      </w:r>
+      <w:proofErr w:type="spellEnd"/>
+      <w:r>
+        <w:t>; (</w:t>
+      </w:r>
+      <w:proofErr w:type="spellStart"/>
+      <w:r>
+        <w:t>Mitana</w:t>
+      </w:r>
+      <w:proofErr w:type="spellEnd"/>
+      <w:r>
+        <w:t>)</w:t>
+      </w:r>
+    </w:p>
+    <w:p>
+      <w:r>
+        <w:pict w14:anchorId="1F5ED467">
+          <v:rect id="_x0000_i1030" style="width:0;height:1.5pt" o:hralign="center" o:hrstd="t" o:hr="t" fillcolor="#a0a0a0" stroked="f"/>
+        </w:pict>
+      </w:r>
+    </w:p>
+    <w:p>
+      <w:pPr>
+        <w:rPr>
+          <w:b/>
+          <w:bCs/>
+          <w:sz w:val="40"/>
+          <w:szCs w:val="40"/>
+          <w:u w:val="single"/>
+        </w:rPr>
+      </w:pPr>
+      <w:r>
+        <w:rPr>
+          <w:b/>
+          <w:bCs/>
+          <w:sz w:val="40"/>
+          <w:szCs w:val="40"/>
+          <w:u w:val="single"/>
+        </w:rPr>
+        <w:t>SQL NOTES (</w:t>
+      </w:r>
+      <w:r>
+        <w:rPr>
+          <w:b/>
+          <w:bCs/>
+          <w:sz w:val="40"/>
+          <w:szCs w:val="40"/>
+          <w:u w:val="single"/>
+        </w:rPr>
+        <w:t>6</w:t>
+      </w:r>
+      <w:r>
+        <w:rPr>
+          <w:b/>
+          <w:bCs/>
+          <w:sz w:val="40"/>
+          <w:szCs w:val="40"/>
+          <w:u w:val="single"/>
+        </w:rPr>
+        <w:t>)</w:t>
       </w:r>
     </w:p>
     <w:p/>
@@ -8245,6 +9905,119 @@
     </w:lvl>
   </w:abstractNum>
   <w:abstractNum w:abstractNumId="7" w15:restartNumberingAfterBreak="0">
+    <w:nsid w:val="2B872020"/>
+    <w:multiLevelType w:val="multilevel"/>
+    <w:tmpl w:val="631CC850"/>
+    <w:lvl w:ilvl="0">
+      <w:start w:val="1"/>
+      <w:numFmt w:val="decimal"/>
+      <w:lvlText w:val="%1."/>
+      <w:lvlJc w:val="left"/>
+      <w:pPr>
+        <w:tabs>
+          <w:tab w:val="num" w:pos="720"/>
+        </w:tabs>
+        <w:ind w:left="720" w:hanging="360"/>
+      </w:pPr>
+    </w:lvl>
+    <w:lvl w:ilvl="1" w:tentative="1">
+      <w:start w:val="1"/>
+      <w:numFmt w:val="decimal"/>
+      <w:lvlText w:val="%2."/>
+      <w:lvlJc w:val="left"/>
+      <w:pPr>
+        <w:tabs>
+          <w:tab w:val="num" w:pos="1440"/>
+        </w:tabs>
+        <w:ind w:left="1440" w:hanging="360"/>
+      </w:pPr>
+    </w:lvl>
+    <w:lvl w:ilvl="2" w:tentative="1">
+      <w:start w:val="1"/>
+      <w:numFmt w:val="decimal"/>
+      <w:lvlText w:val="%3."/>
+      <w:lvlJc w:val="left"/>
+      <w:pPr>
+        <w:tabs>
+          <w:tab w:val="num" w:pos="2160"/>
+        </w:tabs>
+        <w:ind w:left="2160" w:hanging="360"/>
+      </w:pPr>
+    </w:lvl>
+    <w:lvl w:ilvl="3" w:tentative="1">
+      <w:start w:val="1"/>
+      <w:numFmt w:val="decimal"/>
+      <w:lvlText w:val="%4."/>
+      <w:lvlJc w:val="left"/>
+      <w:pPr>
+        <w:tabs>
+          <w:tab w:val="num" w:pos="2880"/>
+        </w:tabs>
+        <w:ind w:left="2880" w:hanging="360"/>
+      </w:pPr>
+    </w:lvl>
+    <w:lvl w:ilvl="4" w:tentative="1">
+      <w:start w:val="1"/>
+      <w:numFmt w:val="decimal"/>
+      <w:lvlText w:val="%5."/>
+      <w:lvlJc w:val="left"/>
+      <w:pPr>
+        <w:tabs>
+          <w:tab w:val="num" w:pos="3600"/>
+        </w:tabs>
+        <w:ind w:left="3600" w:hanging="360"/>
+      </w:pPr>
+    </w:lvl>
+    <w:lvl w:ilvl="5" w:tentative="1">
+      <w:start w:val="1"/>
+      <w:numFmt w:val="decimal"/>
+      <w:lvlText w:val="%6."/>
+      <w:lvlJc w:val="left"/>
+      <w:pPr>
+        <w:tabs>
+          <w:tab w:val="num" w:pos="4320"/>
+        </w:tabs>
+        <w:ind w:left="4320" w:hanging="360"/>
+      </w:pPr>
+    </w:lvl>
+    <w:lvl w:ilvl="6" w:tentative="1">
+      <w:start w:val="1"/>
+      <w:numFmt w:val="decimal"/>
+      <w:lvlText w:val="%7."/>
+      <w:lvlJc w:val="left"/>
+      <w:pPr>
+        <w:tabs>
+          <w:tab w:val="num" w:pos="5040"/>
+        </w:tabs>
+        <w:ind w:left="5040" w:hanging="360"/>
+      </w:pPr>
+    </w:lvl>
+    <w:lvl w:ilvl="7" w:tentative="1">
+      <w:start w:val="1"/>
+      <w:numFmt w:val="decimal"/>
+      <w:lvlText w:val="%8."/>
+      <w:lvlJc w:val="left"/>
+      <w:pPr>
+        <w:tabs>
+          <w:tab w:val="num" w:pos="5760"/>
+        </w:tabs>
+        <w:ind w:left="5760" w:hanging="360"/>
+      </w:pPr>
+    </w:lvl>
+    <w:lvl w:ilvl="8" w:tentative="1">
+      <w:start w:val="1"/>
+      <w:numFmt w:val="decimal"/>
+      <w:lvlText w:val="%9."/>
+      <w:lvlJc w:val="left"/>
+      <w:pPr>
+        <w:tabs>
+          <w:tab w:val="num" w:pos="6480"/>
+        </w:tabs>
+        <w:ind w:left="6480" w:hanging="360"/>
+      </w:pPr>
+    </w:lvl>
+  </w:abstractNum>
+  <w:abstractNum w:abstractNumId="8" w15:restartNumberingAfterBreak="0">
     <w:nsid w:val="32482233"/>
     <w:multiLevelType w:val="multilevel"/>
     <w:tmpl w:val="8E803594"/>
@@ -8393,7 +10166,7 @@
       </w:rPr>
     </w:lvl>
   </w:abstractNum>
-  <w:abstractNum w:abstractNumId="8" w15:restartNumberingAfterBreak="0">
+  <w:abstractNum w:abstractNumId="9" w15:restartNumberingAfterBreak="0">
     <w:nsid w:val="32F93083"/>
     <w:multiLevelType w:val="multilevel"/>
     <w:tmpl w:val="86C24F80"/>
@@ -8542,7 +10315,7 @@
       </w:rPr>
     </w:lvl>
   </w:abstractNum>
-  <w:abstractNum w:abstractNumId="9" w15:restartNumberingAfterBreak="0">
+  <w:abstractNum w:abstractNumId="10" w15:restartNumberingAfterBreak="0">
     <w:nsid w:val="47E563E3"/>
     <w:multiLevelType w:val="multilevel"/>
     <w:tmpl w:val="A2A2CF26"/>
@@ -8691,7 +10464,7 @@
       </w:rPr>
     </w:lvl>
   </w:abstractNum>
-  <w:abstractNum w:abstractNumId="10" w15:restartNumberingAfterBreak="0">
+  <w:abstractNum w:abstractNumId="11" w15:restartNumberingAfterBreak="0">
     <w:nsid w:val="4A0605B1"/>
     <w:multiLevelType w:val="multilevel"/>
     <w:tmpl w:val="F146CE66"/>
@@ -8840,7 +10613,7 @@
       </w:rPr>
     </w:lvl>
   </w:abstractNum>
-  <w:abstractNum w:abstractNumId="11" w15:restartNumberingAfterBreak="0">
+  <w:abstractNum w:abstractNumId="12" w15:restartNumberingAfterBreak="0">
     <w:nsid w:val="537F6F6E"/>
     <w:multiLevelType w:val="multilevel"/>
     <w:tmpl w:val="24D8B47C"/>
@@ -8989,7 +10762,7 @@
       </w:rPr>
     </w:lvl>
   </w:abstractNum>
-  <w:abstractNum w:abstractNumId="12" w15:restartNumberingAfterBreak="0">
+  <w:abstractNum w:abstractNumId="13" w15:restartNumberingAfterBreak="0">
     <w:nsid w:val="70AB1759"/>
     <w:multiLevelType w:val="multilevel"/>
     <w:tmpl w:val="CB563D96"/>
@@ -9138,7 +10911,7 @@
       </w:rPr>
     </w:lvl>
   </w:abstractNum>
-  <w:abstractNum w:abstractNumId="13" w15:restartNumberingAfterBreak="0">
+  <w:abstractNum w:abstractNumId="14" w15:restartNumberingAfterBreak="0">
     <w:nsid w:val="78203F1E"/>
     <w:multiLevelType w:val="multilevel"/>
     <w:tmpl w:val="37725874"/>
@@ -9287,7 +11060,7 @@
       </w:rPr>
     </w:lvl>
   </w:abstractNum>
-  <w:abstractNum w:abstractNumId="14" w15:restartNumberingAfterBreak="0">
+  <w:abstractNum w:abstractNumId="15" w15:restartNumberingAfterBreak="0">
     <w:nsid w:val="79D0642C"/>
     <w:multiLevelType w:val="multilevel"/>
     <w:tmpl w:val="7FF8DCB4"/>
@@ -9437,16 +11210,16 @@
     </w:lvl>
   </w:abstractNum>
   <w:num w:numId="1" w16cid:durableId="1897356771">
-    <w:abstractNumId w:val="13"/>
+    <w:abstractNumId w:val="14"/>
   </w:num>
   <w:num w:numId="2" w16cid:durableId="872227209">
     <w:abstractNumId w:val="3"/>
   </w:num>
   <w:num w:numId="3" w16cid:durableId="901864982">
-    <w:abstractNumId w:val="8"/>
+    <w:abstractNumId w:val="9"/>
   </w:num>
   <w:num w:numId="4" w16cid:durableId="1467238388">
-    <w:abstractNumId w:val="10"/>
+    <w:abstractNumId w:val="11"/>
   </w:num>
   <w:num w:numId="5" w16cid:durableId="1700007048">
     <w:abstractNumId w:val="2"/>
@@ -9455,7 +11228,7 @@
     <w:abstractNumId w:val="0"/>
   </w:num>
   <w:num w:numId="7" w16cid:durableId="300574769">
-    <w:abstractNumId w:val="12"/>
+    <w:abstractNumId w:val="13"/>
   </w:num>
   <w:num w:numId="8" w16cid:durableId="1018000134">
     <w:abstractNumId w:val="4"/>
@@ -9467,19 +11240,22 @@
     <w:abstractNumId w:val="6"/>
   </w:num>
   <w:num w:numId="11" w16cid:durableId="1075936436">
-    <w:abstractNumId w:val="14"/>
+    <w:abstractNumId w:val="15"/>
   </w:num>
   <w:num w:numId="12" w16cid:durableId="1392194558">
-    <w:abstractNumId w:val="11"/>
+    <w:abstractNumId w:val="12"/>
   </w:num>
   <w:num w:numId="13" w16cid:durableId="950627346">
-    <w:abstractNumId w:val="9"/>
+    <w:abstractNumId w:val="10"/>
   </w:num>
   <w:num w:numId="14" w16cid:durableId="1752307827">
-    <w:abstractNumId w:val="7"/>
+    <w:abstractNumId w:val="8"/>
   </w:num>
   <w:num w:numId="15" w16cid:durableId="1942108100">
     <w:abstractNumId w:val="5"/>
+  </w:num>
+  <w:num w:numId="16" w16cid:durableId="253638407">
+    <w:abstractNumId w:val="7"/>
   </w:num>
 </w:numbering>
 </file>

</xml_diff>